<commit_message>
Add pooled sulfonylurea comparator as pre-specified secondary analysis
Keep DPP-4 inhibitor as the primary active comparator, since it is weight- and
cardiovascular-neutral and the outcome (CKM stage transition) is partly defined
by adiposity and metabolic risk. Add sulfonylureas as a secondary comparator so
the two contrasts bracket comparator-induced bias, mirroring the pooled
glucose-lowering-drug comparator used in the team's Neurology 2026 target trial
emulation. Fund the addition by cutting the resident-teaching clause from the
capacity section; description now 497/500 words.

Co-Authored-By: Claude Opus 4.8 <noreply@anthropic.com>
Claude-Session: https://claude.ai/code/session_01E69iBL6ckgtG1oXYAcnRgc
</commit_message>
<xml_diff>
--- a/docs/REACH_LOI_proposal_filled.docx
+++ b/docs/REACH_LOI_proposal_filled.docx
@@ -2121,7 +2121,7 @@
                 <w:rFonts w:ascii="Arial" w:hAnsi="Arial" w:cs="Arial"/>
                 <w:sz w:val="20"/>
               </w:rPr>
-              <w:t xml:space="preserve"> Eligible: adults staged CKM 1-2 with baseline labs, no prior-year GLP-1 RA. Strategies: GLP-1 RA (tirzepatide included) versus DPP-4 inhibitor (no MACE benefit) in type 2 diabetes, otherwise versus non-incretin anti-obesity medication. Time zero: first fill; 90-day grace period, clone-censoring and censoring weights remove immortal time; propensity-score overlap weighting approximates randomized assignment, SGLT2 inhibitors time-varying. Re-staged six-monthly; progression is primary, regression a lower stage at two consecutive assessments on reversible components; stage 3 by PREVENT risk; death competes (multistate model). Observational intention-to-treat; per-protocol censoring 60-day gaps; E-values bound unmeasured confounding.</w:t>
+              <w:t xml:space="preserve"> Eligible: adults staged CKM 1-2 with baseline labs, no prior-year GLP-1 RA. Strategies: GLP-1 RA (tirzepatide included) versus DPP-4 inhibitor (no MACE benefit) in type 2 diabetes, otherwise versus non-incretin anti-obesity medication; a secondary comparator adds sulfonylureas, bracketing weight-gain bias. Time zero: first fill; 90-day grace period, clone-censoring and censoring weights remove immortal time; propensity-score overlap weighting approximates randomized assignment, SGLT2 inhibitors time-varying. Re-staged six-monthly; progression is primary, regression a lower stage at two consecutive assessments on reversible components; stage 3 by PREVENT risk; death competes (multistate model). Observational intention-to-treat; per-protocol censoring 60-day gaps; E-values bound unmeasured confounding.</w:t>
             </w:r>
           </w:p>
           <w:p>
@@ -2241,7 +2241,7 @@
                 <w:rFonts w:ascii="Arial" w:hAnsi="Arial" w:cs="Arial"/>
                 <w:sz w:val="20"/>
               </w:rPr>
-              <w:t xml:space="preserve"> As ten-year Multi-PI of the NYC All of Us Consortium (35,000+ enrolled, 9 FTE) I was selected for a beta Workbench use case decomposing metabolic syndrome into components, analogous to CKM staging. I am Division Chief and Director of Research at NYC H+H/Harlem. As the endocrinologist these patients reach after progressing, I build evidence for clinicians upstream, including 500+ residents I taught. Data are Workbench-ready: no recruitment or new collection.</w:t>
+              <w:t xml:space="preserve"> As ten-year Multi-PI of the NYC All of Us Consortium (35,000+ enrolled, 9 FTE) I was selected for a beta Workbench use case decomposing metabolic syndrome into components, analogous to CKM staging. I am Division Chief and Director of Research at NYC H+H/Harlem. As the endocrinologist these patients reach after progressing, I build evidence for clinicians upstream. Data are Workbench-ready: no recruitment or new collection.</w:t>
             </w:r>
           </w:p>
           <w:p>

</xml_diff>

<commit_message>
Add itemized budget and fill the form's funding fields
Enter 10% applicant time, $20,000.00 requested, and the amount in words on the
form. Add an itemized 12-month budget: All of Us Workbench cloud compute at
$250/month and AI-assisted code development tooling at $250/month (Claude Code
Max plus API) as confirmed lines, with investigator protected time, open-access
fee, and dissemination travel as lines needing institutional rates.

Document the All of Us Data User Code of Conduct constraint: participant-level
data cannot leave the Researcher Workbench, so the AI line is scoped to code
development rather than data analysis, and only aggregated statistics with cell
counts of at least 20 may be exported. Flag F&A treatment as the open question
that could force the direct lines down.

Co-Authored-By: Claude Opus 4.8 <noreply@anthropic.com>
Claude-Session: https://claude.ai/code/session_01E69iBL6ckgtG1oXYAcnRgc
</commit_message>
<xml_diff>
--- a/docs/REACH_LOI_proposal_filled.docx
+++ b/docs/REACH_LOI_proposal_filled.docx
@@ -2396,6 +2396,14 @@
               </w:rPr>
               <w:t>PERCENTAGE OF TIME DEDICATED TO PROJECT (APPLICANT):</w:t>
             </w:r>
+            <w:r>
+              <w:rPr>
+                <w:rFonts w:ascii="Arial" w:hAnsi="Arial" w:cs="Arial"/>
+                <w:b/>
+                <w:sz w:val="20"/>
+              </w:rPr>
+              <w:t xml:space="preserve"> 10%</w:t>
+            </w:r>
           </w:p>
         </w:tc>
       </w:tr>
@@ -2438,6 +2446,14 @@
               </w:rPr>
               <w:t>:</w:t>
             </w:r>
+            <w:r>
+              <w:rPr>
+                <w:rFonts w:ascii="Arial" w:hAnsi="Arial" w:cs="Arial"/>
+                <w:b/>
+                <w:sz w:val="20"/>
+              </w:rPr>
+              <w:t xml:space="preserve"> $20,000.00</w:t>
+            </w:r>
           </w:p>
           <w:p>
             <w:pPr>
@@ -2451,6 +2467,14 @@
                 <w:rFonts w:ascii="Arial" w:hAnsi="Arial" w:cs="Arial"/>
               </w:rPr>
               <w:t xml:space="preserve">Also write the amount in words: </w:t>
+            </w:r>
+            <w:r>
+              <w:rPr>
+                <w:rFonts w:ascii="Arial" w:hAnsi="Arial" w:cs="Arial"/>
+                <w:b/>
+                <w:sz w:val="20"/>
+              </w:rPr>
+              <w:t xml:space="preserve">Twenty thousand US dollars</w:t>
             </w:r>
           </w:p>
           <w:p>

</xml_diff>

<commit_message>
Restrict scope to type 2 diabetes at CKM stage 2
GLP-1 therapy for glycemic control and for weight in non-diabetic obesity are
distinct clinical questions requiring different comparators, and non-diabetic
GLP-1 use barely exists in All of Us records ending around 2023. Restricting to
type 2 diabetes gives one decision node and one comparator class (DPP-4
inhibitor, with sulfonylureas secondary), and names non-diabetic obesity as
separate follow-on work.

Because type 2 diabetes is itself a CKM stage 2 criterion, the cohort is stage 2
rather than stages 1-2: progression to stages 3-4 becomes the primary outcome
and regression is scored on reversible components rather than a full stage drop.
Retitle accordingly. Description now 491/500 words, title 89/100 characters.

Co-Authored-By: Claude Opus 4.8 <noreply@anthropic.com>
Claude-Session: https://claude.ai/code/session_01E69iBL6ckgtG1oXYAcnRgc
</commit_message>
<xml_diff>
--- a/docs/REACH_LOI_proposal_filled.docx
+++ b/docs/REACH_LOI_proposal_filled.docx
@@ -1585,7 +1585,7 @@
                 <w:b/>
                 <w:sz w:val="20"/>
               </w:rPr>
-              <w:t xml:space="preserve">CKM Stage Transition, Not Events: Early GLP-1 Therapy in Stages 1-2 for Primary Care Prevention</w:t>
+              <w:t xml:space="preserve">Stage Transition, Not Events: Slowing CKM Progression with Early GLP-1 in Type 2 Diabetes</w:t>
             </w:r>
           </w:p>
           <w:p/>
@@ -2049,7 +2049,7 @@
                 <w:rFonts w:ascii="Arial" w:hAnsi="Arial" w:cs="Arial"/>
                 <w:sz w:val="20"/>
               </w:rPr>
-              <w:t xml:space="preserve"> Using NIH All of Us data, we will estimate whether initiating a GLP-1 receptor agonist (GLP-1 RA) is associated with movement to a lower cardiovascular-kidney-metabolic (CKM) stage, or slower progression, in adults at CKM stage 1-2: stage transition, an endpoint no pivotal GLP-1 RA trial measured.</w:t>
+              <w:t xml:space="preserve"> Using NIH All of Us data, we will estimate whether initiating a GLP-1 receptor agonist (GLP-1 RA) is associated with slower progression from cardiovascular-kidney-metabolic (CKM) stage 2 to stages 3-4, or regression of reversible CKM components, among adults with type 2 diabetes: stage transition, an endpoint no pivotal GLP-1 RA trial measured.</w:t>
             </w:r>
           </w:p>
           <w:p>
@@ -2073,7 +2073,7 @@
                 <w:rFonts w:ascii="Arial" w:hAnsi="Arial" w:cs="Arial"/>
                 <w:sz w:val="20"/>
               </w:rPr>
-              <w:t xml:space="preserve"> The 2026 AHA/ACC/ADA/ASN guideline makes preventing progression and promoting regression the goal of CKM care, yet SELECT, FLOW and SUMMIT enrolled stage 3-4 patients counting events; ongoing DASH-CKMH targets sex-based heterogeneity. Early stages in primary care remain unstudied. Since May and July 2026, Medicaid's BALANCE Model and Medicare's GLP-1 Bridge have expanded access for mostly stage 1-2 adults, scaling prescribing ahead of evidence.</w:t>
+              <w:t xml:space="preserve"> The 2026 AHA/ACC/ADA/ASN guideline makes preventing progression and promoting regression the goal of CKM care, yet SELECT, FLOW and SUMMIT counted events in advanced disease and none tracked stage movement; ongoing DASH-CKMH targets sex-based heterogeneity. Stage 2 diabetes without established cardiovascular disease, primary care's core panel, is least studied, even as GLP-1 prescribing scales far ahead of trajectory evidence.</w:t>
             </w:r>
           </w:p>
           <w:p>
@@ -2097,7 +2097,7 @@
                 <w:rFonts w:ascii="Arial" w:hAnsi="Arial" w:cs="Arial"/>
                 <w:sz w:val="20"/>
               </w:rPr>
-              <w:t xml:space="preserve"> (1) Extend cross-sectional CKM staging into a serial, time-updated stage variable and count initiators; (2) estimate GLP-1 RA initiation's association with stage progression and regression; (3) test pre-specified modification by race/ethnicity and insurance.</w:t>
+              <w:t xml:space="preserve"> (1) Extend cross-sectional CKM staging into a serial, time-updated stage variable and count initiators; (2) estimate GLP-1 RA initiation's association with stage progression and component regression; (3) test pre-specified modification by race/ethnicity and insurance.</w:t>
             </w:r>
           </w:p>
           <w:p>
@@ -2121,7 +2121,7 @@
                 <w:rFonts w:ascii="Arial" w:hAnsi="Arial" w:cs="Arial"/>
                 <w:sz w:val="20"/>
               </w:rPr>
-              <w:t xml:space="preserve"> Eligible: adults staged CKM 1-2 with baseline labs, no prior-year GLP-1 RA. Strategies: GLP-1 RA (tirzepatide included) versus DPP-4 inhibitor (no MACE benefit) in type 2 diabetes, otherwise versus non-incretin anti-obesity medication; a secondary comparator adds sulfonylureas, bracketing weight-gain bias. Time zero: first fill; 90-day grace period, clone-censoring and censoring weights remove immortal time; propensity-score overlap weighting approximates randomized assignment, SGLT2i balanced at baseline. Re-staged six-monthly; progression is primary, regression a lower stage at two consecutive assessments on reversible components; stage 3 by PREVENT risk; death competes (multistate model). Observational intention-to-treat; per-protocol censoring 60-day gaps; E-values bound unmeasured confounding.</w:t>
+              <w:t xml:space="preserve"> Eligible: adults with type 2 diabetes staged CKM 2, baseline labs, no prior-year GLP-1 RA. Strategies: GLP-1 RA (tirzepatide included) versus DPP-4 inhibitor (no MACE benefit); a secondary comparator adds sulfonylureas, bracketing weight-gain bias. Time zero: first fill; 90-day grace period, clone-censoring and censoring weights remove immortal time; propensity-score overlap weighting approximates randomized assignment, SGLT2i balanced at baseline. Re-staged six-monthly; progression to stage 3-4 primary, component regression secondary; stage 3 by PREVENT risk; death competes (multistate model). Observational intention-to-treat; per-protocol censoring 60-day gaps; E-values bound unmeasured confounding.</w:t>
             </w:r>
           </w:p>
           <w:p>
@@ -2145,7 +2145,7 @@
                 <w:rFonts w:ascii="Arial" w:hAnsi="Arial" w:cs="Arial"/>
                 <w:sz w:val="20"/>
               </w:rPr>
-              <w:t xml:space="preserve"> Two-thirds of staged All of Us participants fall at stages 1-2; from 400,000+ participants with linked records we draw initiators and comparators. We anticipate several thousand stage 2 and several hundred stage 1 initiators; stage 1 pools with stage 2 below 500. Records extend to about 2023, so we analyze earlier initiators; transitions accrue years before events.</w:t>
+              <w:t xml:space="preserve"> Published All of Us staging places roughly 46% of participants at CKM stage 2; from 400,000+ with linked records we draw the diabetic subset initiating therapy, anticipating several thousand. Records extend to about 2023, so we analyze earlier initiators; transitions accrue years before events.</w:t>
             </w:r>
           </w:p>
           <w:p>
@@ -2169,7 +2169,7 @@
                 <w:rFonts w:ascii="Arial" w:hAnsi="Arial" w:cs="Arial"/>
                 <w:sz w:val="20"/>
               </w:rPr>
-              <w:t xml:space="preserve"> Family physicians gain stage-specific progression and regression rates. An association robust to E-values would justify a randomized trial of earlier initiation; a robust null would argue against earlier use ahead of trial evidence, prioritizing stages 3-4. Our cohort includes the Black, Hispanic and lower-income adults carrying the heaviest cardiorenal burden, whom trials under-enroll.</w:t>
+              <w:t xml:space="preserve"> Family physicians gain stage-specific progression and regression rates for the stage 2 diabetes panel they manage. An association robust to E-values would justify a randomized trial of earlier initiation; a robust null would argue against earlier use ahead of trial evidence. Our cohort includes the Black, Hispanic and lower-income adults carrying the heaviest cardiorenal burden, whom trials under-enroll. Non-diabetic obesity is a separate question we will address subsequently.</w:t>
             </w:r>
           </w:p>
           <w:p>
@@ -2217,7 +2217,7 @@
                 <w:rFonts w:ascii="Arial" w:hAnsi="Arial" w:cs="Arial"/>
                 <w:sz w:val="20"/>
               </w:rPr>
-              <w:t xml:space="preserve"> Dr. Yong Eun, the board-certified primary care internist who sees these stage 1-2 patients at NYC H+H/Harlem and first-authored our Neurology (2026) semaglutide paper, supports this project and will co-lead the analysis; Dr. Marie S. Thearle adds cardiometabolic expertise.</w:t>
+              <w:t xml:space="preserve"> Dr. Yong Eun, the board-certified primary care internist who sees these stage 2 patients at NYC H+H/Harlem and first-authored our Neurology (2026) semaglutide paper, supports this project and will co-lead the analysis; Dr. Marie S. Thearle adds cardiometabolic expertise.</w:t>
             </w:r>
           </w:p>
           <w:p>

</xml_diff>

<commit_message>
Make stage 2 to 3/4 transition the single primary outcome
Remove all regression language and the follow-on obesity statement. Progression
from CKM stage 2 to stages 3-4 is now the only outcome, with the kidney and
cardiovascular pathways analyzed separately in place of the former secondary.
Section (b) cites the guideline's progression-prevention goal only.

Description now 479/500 words, leaving 21 words of margin.

Co-Authored-By: Claude Opus 4.8 <noreply@anthropic.com>
Claude-Session: https://claude.ai/code/session_01E69iBL6ckgtG1oXYAcnRgc
</commit_message>
<xml_diff>
--- a/docs/REACH_LOI_proposal_filled.docx
+++ b/docs/REACH_LOI_proposal_filled.docx
@@ -2049,7 +2049,7 @@
                 <w:rFonts w:ascii="Arial" w:hAnsi="Arial" w:cs="Arial"/>
                 <w:sz w:val="20"/>
               </w:rPr>
-              <w:t xml:space="preserve"> Using NIH All of Us data, we will estimate whether initiating a GLP-1 receptor agonist (GLP-1 RA) is associated with slower progression from cardiovascular-kidney-metabolic (CKM) stage 2 to stages 3-4, or regression of reversible CKM components, among adults with type 2 diabetes: stage transition, an endpoint no pivotal GLP-1 RA trial measured.</w:t>
+              <w:t xml:space="preserve"> Using NIH All of Us data, we will estimate whether initiating a GLP-1 receptor agonist (GLP-1 RA) is associated with slower progression from cardiovascular-kidney-metabolic (CKM) stage 2 to stages 3-4 among adults with type 2 diabetes: stage transition, an endpoint no pivotal GLP-1 RA trial measured.</w:t>
             </w:r>
           </w:p>
           <w:p>
@@ -2073,7 +2073,7 @@
                 <w:rFonts w:ascii="Arial" w:hAnsi="Arial" w:cs="Arial"/>
                 <w:sz w:val="20"/>
               </w:rPr>
-              <w:t xml:space="preserve"> The 2026 AHA/ACC/ADA/ASN guideline makes preventing progression and promoting regression the goal of CKM care, yet SELECT, FLOW and SUMMIT counted events in advanced disease and none tracked stage movement; ongoing DASH-CKMH targets sex-based heterogeneity. Stage 2 diabetes without established cardiovascular disease, primary care's core panel, is least studied, even as GLP-1 prescribing scales far ahead of trajectory evidence.</w:t>
+              <w:t xml:space="preserve"> The 2026 AHA/ACC/ADA/ASN guideline makes preventing CKM stage progression the goal of care, yet SELECT, FLOW and SUMMIT counted events in advanced disease and none tracked stage movement; ongoing DASH-CKMH targets sex-based heterogeneity. Stage 2 diabetes without established cardiovascular disease, primary care's core panel, is least studied, even as GLP-1 prescribing scales far ahead of trajectory evidence.</w:t>
             </w:r>
           </w:p>
           <w:p>
@@ -2097,7 +2097,7 @@
                 <w:rFonts w:ascii="Arial" w:hAnsi="Arial" w:cs="Arial"/>
                 <w:sz w:val="20"/>
               </w:rPr>
-              <w:t xml:space="preserve"> (1) Extend cross-sectional CKM staging into a serial, time-updated stage variable and count initiators; (2) estimate GLP-1 RA initiation's association with stage progression and component regression; (3) test pre-specified modification by race/ethnicity and insurance.</w:t>
+              <w:t xml:space="preserve"> (1) Extend cross-sectional CKM staging into a serial, time-updated stage variable and count initiators; (2) estimate GLP-1 RA initiation's association with progression from stage 2 to stages 3-4; (3) test pre-specified modification by race/ethnicity and insurance.</w:t>
             </w:r>
           </w:p>
           <w:p>
@@ -2121,7 +2121,7 @@
                 <w:rFonts w:ascii="Arial" w:hAnsi="Arial" w:cs="Arial"/>
                 <w:sz w:val="20"/>
               </w:rPr>
-              <w:t xml:space="preserve"> Eligible: adults with type 2 diabetes staged CKM 2, baseline labs, no prior-year GLP-1 RA. Strategies: GLP-1 RA (tirzepatide included) versus DPP-4 inhibitor (no MACE benefit); a secondary comparator adds sulfonylureas, bracketing weight-gain bias. Time zero: first fill; 90-day grace period, clone-censoring and censoring weights remove immortal time; propensity-score overlap weighting approximates randomized assignment, SGLT2i balanced at baseline. Re-staged six-monthly; progression to stage 3-4 primary, component regression secondary; stage 3 by PREVENT risk; death competes (multistate model). Observational intention-to-treat; per-protocol censoring 60-day gaps; E-values bound unmeasured confounding.</w:t>
+              <w:t xml:space="preserve"> Eligible: adults with type 2 diabetes staged CKM 2, baseline labs, no prior-year GLP-1 RA. Strategies: GLP-1 RA (tirzepatide included) versus DPP-4 inhibitor (no MACE benefit); a secondary comparator adds sulfonylureas, bracketing weight-gain bias. Time zero: first fill; 90-day grace period, clone-censoring and censoring weights remove immortal time; propensity-score overlap weighting approximates randomized assignment, SGLT2i balanced at baseline. Stage re-assessed six-monthly; progression to stage 3-4 is primary, with kidney and cardiovascular pathways analyzed separately; stage 3 by PREVENT risk; death competes (multistate model). Observational intention-to-treat; per-protocol censoring 60-day gaps; E-values bound unmeasured confounding.</w:t>
             </w:r>
           </w:p>
           <w:p>
@@ -2169,7 +2169,7 @@
                 <w:rFonts w:ascii="Arial" w:hAnsi="Arial" w:cs="Arial"/>
                 <w:sz w:val="20"/>
               </w:rPr>
-              <w:t xml:space="preserve"> Family physicians gain stage-specific progression and regression rates for the stage 2 diabetes panel they manage. An association robust to E-values would justify a randomized trial of earlier initiation; a robust null would argue against earlier use ahead of trial evidence. Our cohort includes the Black, Hispanic and lower-income adults carrying the heaviest cardiorenal burden, whom trials under-enroll. Non-diabetic obesity is a separate question we will address subsequently.</w:t>
+              <w:t xml:space="preserve"> Family physicians gain stage-specific progression rates for the stage 2 diabetes panel they manage. An association robust to E-values would justify a randomized trial of earlier initiation; a robust null would argue against earlier use ahead of trial evidence. Our cohort includes the Black, Hispanic and lower-income adults carrying the heaviest cardiorenal burden, whom trials under-enroll.</w:t>
             </w:r>
           </w:p>
           <w:p>

</xml_diff>

<commit_message>
Ground section (e) in the team's own prior cohort counts; add Neurology paper
Replace the vague 'anticipating several thousand' with real figures from the
team's prior All of Us target trial emulation in type 2 diabetes: 2,586
semaglutide and 7,627 comparator initiators through October 2023, presented as
a floor because this study includes all GLP-1 RAs. Note that Curated Data
Repository v9 now covers 747,000+ participants with records through January
2025, which supersedes the earlier 'records extend to about 2023' hedge and
lengthens observable follow-up, while restricting to CKM stage 2 pushes counts
down.

Add the Neurology 2026 semaglutide target-trial-emulation paper to Dr.
Trousdale's selected publications, where it is her most directly relevant work.
Description now 492/500 words.

Co-Authored-By: Claude Opus 4.8 <noreply@anthropic.com>
Claude-Session: https://claude.ai/code/session_01E69iBL6ckgtG1oXYAcnRgc
</commit_message>
<xml_diff>
--- a/docs/REACH_LOI_proposal_filled.docx
+++ b/docs/REACH_LOI_proposal_filled.docx
@@ -2145,7 +2145,7 @@
                 <w:rFonts w:ascii="Arial" w:hAnsi="Arial" w:cs="Arial"/>
                 <w:sz w:val="20"/>
               </w:rPr>
-              <w:t xml:space="preserve"> Published All of Us staging places roughly 46% of participants at CKM stage 2; from 400,000+ with linked records we draw the diabetic subset initiating therapy, anticipating several thousand. Records extend to about 2023, so we analyze earlier initiators; transitions accrue years before events.</w:t>
+              <w:t xml:space="preserve"> Our prior All of Us emulation in type 2 diabetes yielded 2,586 semaglutide and 7,627 comparator initiators through October 2023. That is a floor: we include all GLP-1 RAs, and Curated Data Repository v9 now covers 747,000+ participants with records through January 2025. Restricting to CKM stage 2 lowers counts; Objective 1 reports exact numbers and power.</w:t>
             </w:r>
           </w:p>
           <w:p>
@@ -3787,6 +3787,29 @@
                 <w:sz w:val="20"/>
               </w:rPr>
               <w:t xml:space="preserve">Eun Y, Culpepper-Morgan J, Akanmode AM, Thu MB, Sta Lucia AA, Thearle MS, Trousdale RK. Comorbidities and systemic steroids drive pneumonia risk in inflammatory bowel disease: propensity score-matched cohort study. World J Gastrointest Pharmacol Ther. 2025;16(2):105335.</w:t>
+            </w:r>
+          </w:p>
+          <w:p>
+            <w:pPr>
+              <w:spacing w:before="20" w:after="20"/>
+              <w:rPr>
+                <w:rFonts w:ascii="Arial" w:hAnsi="Arial" w:cs="Arial"/>
+                <w:sz w:val="20"/>
+              </w:rPr>
+            </w:pPr>
+            <w:r>
+              <w:rPr>
+                <w:rFonts w:ascii="Arial" w:hAnsi="Arial" w:cs="Arial"/>
+                <w:sz w:val="20"/>
+              </w:rPr>
+              <w:t xml:space="preserve">• </w:t>
+            </w:r>
+            <w:r>
+              <w:rPr>
+                <w:rFonts w:ascii="Arial" w:hAnsi="Arial" w:cs="Arial"/>
+                <w:sz w:val="20"/>
+              </w:rPr>
+              <w:t xml:space="preserve">Eun Y, Bong S, Koh HY, Trousdale RK, Cho YM, Jang Y, Lee ST. Semaglutide and risk of adult-onset seizure: a target trial emulation. Neurology. 2026;107(1):e218174.</w:t>
             </w:r>
           </w:p>
           <w:p>

</xml_diff>

<commit_message>
Paste the budget basis into the submission form
The REACH template has no budget or justification field, so the form carried
only a bare $20,000 total while the itemization lived solely in the internal
review draft. Since awards are made on the fair market value of the research
and the template permits pasting additional material, add a one-line basis
after the amount in words listing all five components, verified to sum to
$20,000.00.

Co-Authored-By: Claude Opus 4.8 <noreply@anthropic.com>
Claude-Session: https://claude.ai/code/session_01E69iBL6ckgtG1oXYAcnRgc
</commit_message>
<xml_diff>
--- a/docs/REACH_LOI_proposal_filled.docx
+++ b/docs/REACH_LOI_proposal_filled.docx
@@ -2484,6 +2484,13 @@
                 <w:rFonts w:ascii="Arial" w:hAnsi="Arial" w:cs="Arial"/>
               </w:rPr>
             </w:pPr>
+            <w:r>
+              <w:rPr>
+                <w:rFonts w:ascii="Arial" w:hAnsi="Arial" w:cs="Arial"/>
+                <w:sz w:val="20"/>
+              </w:rPr>
+              <w:t xml:space="preserve">Basis (12 months): All of Us Researcher Workbench cloud compute $3,000.00 ($250/month); AI-assisted code development $3,000.00 ($250/month); investigator protected time $10,000.00; open-access publication $2,500.00; dissemination travel $1,500.00.</w:t>
+            </w:r>
           </w:p>
           <w:p>
             <w:pPr>

</xml_diff>